<commit_message>
fix: adding the php version
</commit_message>
<xml_diff>
--- a/docs/PEONIFY - THE OVERVIEW.docx
+++ b/docs/PEONIFY - THE OVERVIEW.docx
@@ -259,7 +259,10 @@
         <w:pStyle w:val="ListBullet"/>
       </w:pPr>
       <w:r>
-        <w:t>Table 1: Project budget</w:t>
+        <w:rPr>
+          <w:b w:val="0"/>
+        </w:rPr>
+        <w:t>Table 1: Strengths and weaknesses of existing systems</w:t>
       </w:r>
     </w:p>
     <w:p>
@@ -267,7 +270,10 @@
         <w:pStyle w:val="ListBullet"/>
       </w:pPr>
       <w:r>
-        <w:t>Table 2: Strengths and weaknesses of existing systems</w:t>
+        <w:rPr>
+          <w:b w:val="0"/>
+        </w:rPr>
+        <w:t>Table 2: Functional requirements</w:t>
       </w:r>
     </w:p>
     <w:p>
@@ -275,7 +281,10 @@
         <w:pStyle w:val="ListBullet"/>
       </w:pPr>
       <w:r>
-        <w:t>Table 3: Functional requirements</w:t>
+        <w:rPr>
+          <w:b w:val="0"/>
+        </w:rPr>
+        <w:t>Table 3: Non-functional requirements</w:t>
       </w:r>
     </w:p>
     <w:p>
@@ -283,7 +292,10 @@
         <w:pStyle w:val="ListBullet"/>
       </w:pPr>
       <w:r>
-        <w:t>Table 4: Non-functional requirements</w:t>
+        <w:rPr>
+          <w:b w:val="0"/>
+        </w:rPr>
+        <w:t>Table 4: Development tools</w:t>
       </w:r>
     </w:p>
     <w:p>
@@ -291,7 +303,10 @@
         <w:pStyle w:val="ListBullet"/>
       </w:pPr>
       <w:r>
-        <w:t>Table 5: Development tools</w:t>
+        <w:rPr>
+          <w:b w:val="0"/>
+        </w:rPr>
+        <w:t>Table 5: REST API overview</w:t>
       </w:r>
     </w:p>
     <w:p>
@@ -299,7 +314,10 @@
         <w:pStyle w:val="ListBullet"/>
       </w:pPr>
       <w:r>
-        <w:t>Table 6: REST API overview</w:t>
+        <w:rPr>
+          <w:b w:val="0"/>
+        </w:rPr>
+        <w:t>Table 6: Studied platforms and adopted patterns (Appendix A)</w:t>
       </w:r>
     </w:p>
     <w:p>
@@ -307,7 +325,10 @@
         <w:pStyle w:val="ListBullet"/>
       </w:pPr>
       <w:r>
-        <w:t>Table 7: Studied platforms and adopted patterns (Appendix A)</w:t>
+        <w:rPr>
+          <w:b w:val="0"/>
+        </w:rPr>
+        <w:t>Table 7: Image attribution (Appendix B)</w:t>
       </w:r>
     </w:p>
     <w:p>
@@ -315,15 +336,10 @@
         <w:pStyle w:val="ListBullet"/>
       </w:pPr>
       <w:r>
-        <w:t>Table 8: Image attribution (Appendix B)</w:t>
-      </w:r>
-    </w:p>
-    <w:p>
-      <w:pPr>
-        <w:pStyle w:val="ListBullet"/>
-      </w:pPr>
-      <w:r>
-        <w:t>Table 9: Environment configuration reference (Appendix C)</w:t>
+        <w:rPr>
+          <w:b w:val="0"/>
+        </w:rPr>
+        <w:t>Table 8: Environment configuration reference (Appendix C)</w:t>
       </w:r>
     </w:p>
     <w:p>
@@ -840,346 +856,7 @@
         <w:pStyle w:val="Heading3"/>
       </w:pPr>
       <w:r>
-        <w:t>1.7 Project Budget</w:t>
-      </w:r>
-    </w:p>
-    <w:tbl>
-      <w:tblPr>
-        <w:tblStyle w:val="TableGrid"/>
-        <w:tblW w:type="auto" w:w="0"/>
-        <w:tblLook w:firstColumn="1" w:firstRow="1" w:lastColumn="0" w:lastRow="0" w:noHBand="0" w:noVBand="1" w:val="04A0"/>
-      </w:tblPr>
-      <w:tblGrid>
-        <w:gridCol w:w="2160"/>
-        <w:gridCol w:w="2160"/>
-        <w:gridCol w:w="2160"/>
-        <w:gridCol w:w="2160"/>
-      </w:tblGrid>
-      <w:tr>
-        <w:tc>
-          <w:tcPr>
-            <w:tcW w:type="dxa" w:w="2160"/>
-          </w:tcPr>
-          <w:p>
-            <w:r>
-              <w:rPr>
-                <w:b/>
-              </w:rPr>
-              <w:t>Item</w:t>
-            </w:r>
-          </w:p>
-        </w:tc>
-        <w:tc>
-          <w:tcPr>
-            <w:tcW w:type="dxa" w:w="2160"/>
-          </w:tcPr>
-          <w:p>
-            <w:r>
-              <w:rPr>
-                <w:b/>
-              </w:rPr>
-              <w:t>Description</w:t>
-            </w:r>
-          </w:p>
-        </w:tc>
-        <w:tc>
-          <w:tcPr>
-            <w:tcW w:type="dxa" w:w="2160"/>
-          </w:tcPr>
-          <w:p>
-            <w:r>
-              <w:rPr>
-                <w:b/>
-              </w:rPr>
-              <w:t>Justification</w:t>
-            </w:r>
-          </w:p>
-        </w:tc>
-        <w:tc>
-          <w:tcPr>
-            <w:tcW w:type="dxa" w:w="2160"/>
-          </w:tcPr>
-          <w:p>
-            <w:r>
-              <w:rPr>
-                <w:b/>
-              </w:rPr>
-              <w:t>Estimated Cost (USD)</w:t>
-            </w:r>
-          </w:p>
-        </w:tc>
-      </w:tr>
-      <w:tr>
-        <w:tc>
-          <w:tcPr>
-            <w:tcW w:type="dxa" w:w="2160"/>
-          </w:tcPr>
-          <w:p>
-            <w:r>
-              <w:t>Domain name</w:t>
-            </w:r>
-          </w:p>
-        </w:tc>
-        <w:tc>
-          <w:tcPr>
-            <w:tcW w:type="dxa" w:w="2160"/>
-          </w:tcPr>
-          <w:p>
-            <w:r>
-              <w:t>Purchase of a website domain</w:t>
-            </w:r>
-          </w:p>
-        </w:tc>
-        <w:tc>
-          <w:tcPr>
-            <w:tcW w:type="dxa" w:w="2160"/>
-          </w:tcPr>
-          <w:p>
-            <w:r>
-              <w:t>Professional online presence and easy access for customers.</w:t>
-            </w:r>
-          </w:p>
-        </w:tc>
-        <w:tc>
-          <w:tcPr>
-            <w:tcW w:type="dxa" w:w="2160"/>
-          </w:tcPr>
-          <w:p>
-            <w:r>
-              <w:t>12</w:t>
-            </w:r>
-          </w:p>
-        </w:tc>
-      </w:tr>
-      <w:tr>
-        <w:tc>
-          <w:tcPr>
-            <w:tcW w:type="dxa" w:w="2160"/>
-          </w:tcPr>
-          <w:p>
-            <w:r>
-              <w:t>Web hosting</w:t>
-            </w:r>
-          </w:p>
-        </w:tc>
-        <w:tc>
-          <w:tcPr>
-            <w:tcW w:type="dxa" w:w="2160"/>
-          </w:tcPr>
-          <w:p>
-            <w:r>
-              <w:t>VPS or PaaS node hosting the API and static frontend</w:t>
-            </w:r>
-          </w:p>
-        </w:tc>
-        <w:tc>
-          <w:tcPr>
-            <w:tcW w:type="dxa" w:w="2160"/>
-          </w:tcPr>
-          <w:p>
-            <w:r>
-              <w:t>Required to deploy the platform and serve customers reliably.</w:t>
-            </w:r>
-          </w:p>
-        </w:tc>
-        <w:tc>
-          <w:tcPr>
-            <w:tcW w:type="dxa" w:w="2160"/>
-          </w:tcPr>
-          <w:p>
-            <w:r>
-              <w:t>10 / month</w:t>
-            </w:r>
-          </w:p>
-        </w:tc>
-      </w:tr>
-      <w:tr>
-        <w:tc>
-          <w:tcPr>
-            <w:tcW w:type="dxa" w:w="2160"/>
-          </w:tcPr>
-          <w:p>
-            <w:r>
-              <w:t>Database service</w:t>
-            </w:r>
-          </w:p>
-        </w:tc>
-        <w:tc>
-          <w:tcPr>
-            <w:tcW w:type="dxa" w:w="2160"/>
-          </w:tcPr>
-          <w:p>
-            <w:r>
-              <w:t>Managed PostgreSQL (or self-hosted on the same VPS)</w:t>
-            </w:r>
-          </w:p>
-        </w:tc>
-        <w:tc>
-          <w:tcPr>
-            <w:tcW w:type="dxa" w:w="2160"/>
-          </w:tcPr>
-          <w:p>
-            <w:r>
-              <w:t>Stores users, products, orders, notifications, and feedback securely.</w:t>
-            </w:r>
-          </w:p>
-        </w:tc>
-        <w:tc>
-          <w:tcPr>
-            <w:tcW w:type="dxa" w:w="2160"/>
-          </w:tcPr>
-          <w:p>
-            <w:r>
-              <w:t>0–7 / month</w:t>
-            </w:r>
-          </w:p>
-        </w:tc>
-      </w:tr>
-      <w:tr>
-        <w:tc>
-          <w:tcPr>
-            <w:tcW w:type="dxa" w:w="2160"/>
-          </w:tcPr>
-          <w:p>
-            <w:r>
-              <w:t>SSL certificate</w:t>
-            </w:r>
-          </w:p>
-        </w:tc>
-        <w:tc>
-          <w:tcPr>
-            <w:tcW w:type="dxa" w:w="2160"/>
-          </w:tcPr>
-          <w:p>
-            <w:r>
-              <w:t>Let's Encrypt TLS certificate</w:t>
-            </w:r>
-          </w:p>
-        </w:tc>
-        <w:tc>
-          <w:tcPr>
-            <w:tcW w:type="dxa" w:w="2160"/>
-          </w:tcPr>
-          <w:p>
-            <w:r>
-              <w:t>Encrypts all traffic; required for cookies and payment redirects.</w:t>
-            </w:r>
-          </w:p>
-        </w:tc>
-        <w:tc>
-          <w:tcPr>
-            <w:tcW w:type="dxa" w:w="2160"/>
-          </w:tcPr>
-          <w:p>
-            <w:r>
-              <w:t>0</w:t>
-            </w:r>
-          </w:p>
-        </w:tc>
-      </w:tr>
-      <w:tr>
-        <w:tc>
-          <w:tcPr>
-            <w:tcW w:type="dxa" w:w="2160"/>
-          </w:tcPr>
-          <w:p>
-            <w:r>
-              <w:t>Paystack fees</w:t>
-            </w:r>
-          </w:p>
-        </w:tc>
-        <w:tc>
-          <w:tcPr>
-            <w:tcW w:type="dxa" w:w="2160"/>
-          </w:tcPr>
-          <w:p>
-            <w:r>
-              <w:t>Transaction fees on live payments</w:t>
-            </w:r>
-          </w:p>
-        </w:tc>
-        <w:tc>
-          <w:tcPr>
-            <w:tcW w:type="dxa" w:w="2160"/>
-          </w:tcPr>
-          <w:p>
-            <w:r>
-              <w:t>Per-transaction percentage; zero during test mode.</w:t>
-            </w:r>
-          </w:p>
-        </w:tc>
-        <w:tc>
-          <w:tcPr>
-            <w:tcW w:type="dxa" w:w="2160"/>
-          </w:tcPr>
-          <w:p>
-            <w:r>
-              <w:t>~2.9% / txn</w:t>
-            </w:r>
-          </w:p>
-        </w:tc>
-      </w:tr>
-      <w:tr>
-        <w:tc>
-          <w:tcPr>
-            <w:tcW w:type="dxa" w:w="2160"/>
-          </w:tcPr>
-          <w:p>
-            <w:r>
-              <w:t>Product photography</w:t>
-            </w:r>
-          </w:p>
-        </w:tc>
-        <w:tc>
-          <w:tcPr>
-            <w:tcW w:type="dxa" w:w="2160"/>
-          </w:tcPr>
-          <w:p>
-            <w:r>
-              <w:t>Photographing real arrangements</w:t>
-            </w:r>
-          </w:p>
-        </w:tc>
-        <w:tc>
-          <w:tcPr>
-            <w:tcW w:type="dxa" w:w="2160"/>
-          </w:tcPr>
-          <w:p>
-            <w:r>
-              <w:t>Replaces the openly licensed placeholder imagery before launch.</w:t>
-            </w:r>
-          </w:p>
-        </w:tc>
-        <w:tc>
-          <w:tcPr>
-            <w:tcW w:type="dxa" w:w="2160"/>
-          </w:tcPr>
-          <w:p>
-            <w:r>
-              <w:t>25</w:t>
-            </w:r>
-          </w:p>
-        </w:tc>
-      </w:tr>
-    </w:tbl>
-    <w:p>
-      <w:pPr>
-        <w:jc w:val="center"/>
-      </w:pPr>
-      <w:r>
-        <w:rPr>
-          <w:b/>
-          <w:sz w:val="22"/>
-        </w:rPr>
-        <w:t>Table 1: Project budget</w:t>
-      </w:r>
-    </w:p>
-    <w:p>
-      <w:pPr>
-        <w:pStyle w:val="Heading3"/>
-      </w:pPr>
-      <w:r>
-        <w:t>1.8 Project Timeline</w:t>
+        <w:t>1.7 Project Timeline</w:t>
       </w:r>
     </w:p>
     <w:p>
@@ -1619,7 +1296,7 @@
           <w:b/>
           <w:sz w:val="22"/>
         </w:rPr>
-        <w:t>Table 2: Strengths and weaknesses of existing systems</w:t>
+        <w:t>Table 1: Strengths and weaknesses of existing systems</w:t>
       </w:r>
     </w:p>
     <w:p>
@@ -2185,7 +1862,7 @@
           <w:b/>
           <w:sz w:val="22"/>
         </w:rPr>
-        <w:t>Table 3: Functional requirements</w:t>
+        <w:t>Table 2: Functional requirements</w:t>
       </w:r>
     </w:p>
     <w:p/>
@@ -2443,7 +2120,7 @@
           <w:b/>
           <w:sz w:val="22"/>
         </w:rPr>
-        <w:t>Table 4: Non-functional requirements</w:t>
+        <w:t>Table 3: Non-functional requirements</w:t>
       </w:r>
     </w:p>
     <w:p>
@@ -3274,7 +2951,7 @@
           <w:b/>
           <w:sz w:val="22"/>
         </w:rPr>
-        <w:t>Table 5: Development tools</w:t>
+        <w:t>Table 4: Development tools</w:t>
       </w:r>
     </w:p>
     <w:p>
@@ -3988,7 +3665,7 @@
           <w:b/>
           <w:sz w:val="22"/>
         </w:rPr>
-        <w:t>Table 6: REST API overview</w:t>
+        <w:t>Table 5: REST API overview</w:t>
       </w:r>
     </w:p>
     <w:p>
@@ -4767,7 +4444,7 @@
           <w:b/>
           <w:sz w:val="22"/>
         </w:rPr>
-        <w:t>Table 7: Studied platforms and adopted patterns</w:t>
+        <w:t>Table 6: Studied platforms and adopted patterns</w:t>
       </w:r>
     </w:p>
     <w:p>
@@ -5168,7 +4845,7 @@
           <w:b/>
           <w:sz w:val="22"/>
         </w:rPr>
-        <w:t>Table 8: Image attribution (Wikimedia Commons)</w:t>
+        <w:t>Table 7: Image attribution (Wikimedia Commons)</w:t>
       </w:r>
     </w:p>
     <w:p>
@@ -5433,7 +5110,7 @@
           <w:b/>
           <w:sz w:val="22"/>
         </w:rPr>
-        <w:t>Table 9: Environment configuration reference</w:t>
+        <w:t>Table 8: Environment configuration reference</w:t>
       </w:r>
     </w:p>
     <w:p>

</xml_diff>